<commit_message>
R10: add review-pen subsection (design + capacity rule + CIGR floor)
- Restores pen content from draft 10.11 that was dropped in the EN final:
  independent entry/anti-return, separate handling exit, full-pen pause,
  capacity C >= lambda_q*th + Cm, ~6-head existing pen budget scenario,
  CIGR design floor (sorting pen >= one side of parlour, water/feed/lying)
- Verified CIGR body-dimension table is explicitly Holstein-Friesian
  (Tables 2.1.2.1 / 2.1.3.2); holding-pen advice noted as generic practice
- R10 body 1,497 -> 1,596 words (10.2/10.7 trimmed to offset); EN/CN/
  framework md+docx synced; Cerqueira 2013 HF field data downloaded
  (pending decision on adding to R13)
</commit_message>
<xml_diff>
--- a/08_组员资料/成员4_Part4_交付/ID-Coo_报告提交框架_EN.docx
+++ b/08_组员资料/成员4_Part4_交付/ID-Coo_报告提交框架_EN.docx
@@ -3770,10 +3770,26 @@
     </w:p>
     <w:p>
       <w:pPr>
+        <w:jc w:val="left"/>
+      </w:pPr>
+      <w:r>
+        <w:t>Version 1 uses one buffer and one detection section; extra forward sections add waiting capacity, not throughput, and add gates and failure points. Adjustable commercial alleys (≈526–800 mm wide, 8 ft and 10 ft modules) indicate the structural envelope [13], [14]. Section length, clear width and antenna height follow CIGR standard dimensions for the target breed — adult Holstein–Friesian dairy cows: ≈1.44 m withers height, ≈1.75 m diagonal body length, ≈0.60 m chest width (650–749 kg) [26]; another breed later means re-parameterising the same table, not redesigning. Final dimensions and door swings come from the on-farm survey, and module length is never assumed to equal one animal's length. (UR8, UR9)</w:t>
+      </w:r>
+    </w:p>
+    <w:p>
+      <w:pPr>
+        <w:jc w:val="left"/>
+      </w:pPr>
+      <w:r>
+        <w:t xml:space="preserve">The review pen is a temporary holding area for manual verification, not a disease-isolation facility. It has an independent entry with anti-return control and a separate manual handling exit; gate H closes only after an animal has fully passed, and when the pen is full or the branch is blocked, intake stops and upstream pauses. </w:t>
+      </w:r>
+    </w:p>
+    <w:p>
+      <w:pPr>
         <w:jc w:val="center"/>
       </w:pPr>
       <w:r>
-        <w:t>Version 1 uses one buffer and one detection section; extra forward sections add waiting capacity, not throughput, and add gates and failure points. Adjustable commercial alleys (≈526–800 mm wide, 8 ft and 10 ft modules) indicate the structural envelope [13], [14]. Section length, clear width and antenna height follow CIGR standard dimensions for the target breed — adult Holstein–Friesian dairy cows: ≈1.44 m withers height, ≈1.75 m diagonal body length, ≈0.60 m chest width (650–749 kg) [26]; another breed later means re-parameterising the same table, not redesigning. Final dimensions, door swings and pen layout come from the on-farm survey, and module length is never assumed to equal one animal's length. (UR8, UR9)</w:t>
+        <w:t>Capacity follows C ≥ λq × th + Cm (anomaly rate × handling interval + margin) — an average-load relation that does not cover consecutive anomalies, so full-pen monitoring stays mandatory. The budget scenario reuses an existing pen of about six head; as a design floor, a sorting pen should hold at least one side of the milking parlour, with water, feed and lying space [26].</w:t>
       </w:r>
       <w:r/>
       <w:r>
@@ -4448,7 +4464,7 @@
         <w:jc w:val="left"/>
       </w:pPr>
       <w:r>
-        <w:t>Mechanical separation does not separate radio read zones: even with one animal in B, the antenna may pick up a neighbour's number, so read attribution is tested explicitly (10.7). A cracked tag housing with a working chip, or a missing non-electronic tag, lies outside automatic detection and needs visual inspection. (UR1–UR3, UR9)</w:t>
+        <w:t>Mechanical separation does not separate radio read zones: even with one animal in B, the antenna may pick up a neighbour's number, so read attribution is tested explicitly (10.7). A cracked tag housing with a working chip, or a missing non-electronic tag, needs visual inspection. (UR1–UR3, UR9)</w:t>
       </w:r>
     </w:p>
     <w:p>
@@ -6579,7 +6595,7 @@
         <w:jc w:val="left"/>
       </w:pPr>
       <w:r>
-        <w:t>Measured at each stage: confirmed-read accuracy and coverage separately, mis-diversion rate, exception-handling rate, exit consistency, takeover count and net labour time. Repeating the same herd is not an independent sample, and zero observed errors is not zero risk. Separation, read attribution and safe release are proven before economics; only then do scale-up or added automation follow. (UR1–UR10)</w:t>
+        <w:t>Measured at each stage: confirmed-read accuracy and coverage separately, mis-diversion rate, exception-handling rate, exit consistency, takeover count and net labour time. Repeating the same herd is not an independent sample, and zero observed errors is not zero risk; separation, read attribution and safe release are proven before economics. (UR1–UR10)</w:t>
       </w:r>
     </w:p>
     <w:p>

</xml_diff>

<commit_message>
R10.1: add Cerqueira 2013 HF field data as [27]
- Withers height now dual-sourced: CIGR standard 1.44 m (650-749 kg)
  plus field average 1.41 m from 1,054 Holstein-Friesian cows; body
  length given as 1.71-1.75 m range; ultrasonic crosstalk sentence trimmed
- R13 entry text added to handover notes; EN/CN/framework md+docx synced
</commit_message>
<xml_diff>
--- a/08_组员资料/成员4_Part4_交付/ID-Coo_报告提交框架_EN.docx
+++ b/08_组员资料/成员4_Part4_交付/ID-Coo_报告提交框架_EN.docx
@@ -3773,7 +3773,7 @@
         <w:jc w:val="left"/>
       </w:pPr>
       <w:r>
-        <w:t>Version 1 uses one buffer and one detection section; extra forward sections add waiting capacity, not throughput, and add gates and failure points. Adjustable commercial alleys (≈526–800 mm wide, 8 ft and 10 ft modules) indicate the structural envelope [13], [14]. Section length, clear width and antenna height follow CIGR standard dimensions for the target breed — adult Holstein–Friesian dairy cows: ≈1.44 m withers height, ≈1.75 m diagonal body length, ≈0.60 m chest width (650–749 kg) [26]; another breed later means re-parameterising the same table, not redesigning. Final dimensions and door swings come from the on-farm survey, and module length is never assumed to equal one animal's length. (UR8, UR9)</w:t>
+        <w:t>Version 1 uses one buffer and one detection section; extra forward sections add waiting capacity, not throughput, and add gates and failure points. Adjustable commercial alleys (≈526–800 mm wide, 8 ft and 10 ft modules) indicate the structural envelope [13], [14]. Section length, clear width and antenna height follow CIGR standard dimensions for the target breed — adult Holstein–Friesian dairy cows: ≈1.4 m withers height (CIGR standard 1.44 m in the 650–749 kg class [26]; field average 1.41 m from 1,054 Holstein–Friesian cows [27]), body length ≈1.71–1.75 m and chest width ≈0.60 m [26], [27]; another breed later means re-parameterising from the same tables, not redesigning. Final dimensions and door swings come from the on-farm survey, and module length is never assumed to equal one animal's length. (UR8, UR9)</w:t>
       </w:r>
     </w:p>
     <w:p>
@@ -3886,7 +3886,7 @@
         <w:t>uncertain</w:t>
       </w:r>
       <w:r>
-        <w:t xml:space="preserve"> — no echo, stale data or a device fault means uncertain, never empty, and one echo peak is never counted as one animal [15]. Sensors are evaluated for manufacturer-supported time-shifted transmission to limit crosstalk, with the added polling delay checked [16].</w:t>
+        <w:t xml:space="preserve"> — no echo, stale data or a device fault means uncertain, never empty, and one echo peak is never counted as one animal [15]. Sensors are evaluated for manufacturer-supported time-shifted transmission to limit crosstalk [16].</w:t>
       </w:r>
     </w:p>
     <w:tbl>

</xml_diff>